<commit_message>
Implement FrozenDict for full spec immutability and update conditional GridSearchCV
</commit_message>
<xml_diff>
--- a/docs/Документация_OpenFLL_Python_API.docx
+++ b/docs/Документация_OpenFLL_Python_API.docx
@@ -1802,11 +1802,19 @@
         <w:br/>
         <w:t>scores = cross_val_score(reg, X_train, y_train, cv=5, scoring='r2')</w:t>
         <w:br/>
-        <w:t>grid = GridSearchCV(reg, {'alpha': [0.0, 0.01, 0.1, 1.0]}, cv=3)</w:t>
+        <w:t>param_grid = [</w:t>
+        <w:br/>
+        <w:t xml:space="preserve">    {'solver': ['lstsq'], 'alpha': [0.0]},</w:t>
+        <w:br/>
+        <w:t xml:space="preserve">    {'solver': ['ridge'], 'alpha': [0.01, 0.1, 1.0]},</w:t>
+        <w:br/>
+        <w:t>]</w:t>
+        <w:br/>
+        <w:t>grid = GridSearchCV(reg, param_grid, cv=3, error_score='raise')</w:t>
         <w:br/>
         <w:t>grid.fit(X_train, y_train)</w:t>
         <w:br/>
-        <w:t>print('Лучший параметр alpha:', grid.best_params_)</w:t>
+        <w:t>print('Лучшие параметры:', grid.best_params_)</w:t>
       </w:r>
     </w:p>
     <w:p>

</xml_diff>